<commit_message>
feat: changing last styles
</commit_message>
<xml_diff>
--- a/backend/word/DEPILACJA WOSKIEM.docx
+++ b/backend/word/DEPILACJA WOSKIEM.docx
@@ -85,7 +85,15 @@
     </w:p>
     <w:p>
       <w:r>
-        <w:t>* Usuwany za pomocą pasków fizelinowych.</w:t>
+        <w:t xml:space="preserve">* Usuwany za pomocą pasków </w:t>
+      </w:r>
+      <w:proofErr w:type="spellStart"/>
+      <w:r>
+        <w:t>fizelinowych</w:t>
+      </w:r>
+      <w:proofErr w:type="spellEnd"/>
+      <w:r>
+        <w:t>.</w:t>
       </w:r>
     </w:p>
     <w:p>
@@ -101,7 +109,15 @@
     <w:p/>
     <w:p>
       <w:r>
-        <w:t>2. Wosk twardy (bezpaskowy)</w:t>
+        <w:t>2. Wosk twardy (</w:t>
+      </w:r>
+      <w:proofErr w:type="spellStart"/>
+      <w:r>
+        <w:t>bezpaskowy</w:t>
+      </w:r>
+      <w:proofErr w:type="spellEnd"/>
+      <w:r>
+        <w:t>)</w:t>
       </w:r>
     </w:p>
     <w:p>
@@ -220,7 +236,15 @@
     </w:p>
     <w:p>
       <w:r>
-        <w:t>* przyjmowanie niektórych leków lub stosowanie preparatów na skórę, które mogą uczulać lub sprawiać, że skóra jest bardziej wrażliwa na depilację ( konsultacja z dermatologiem)</w:t>
+        <w:t xml:space="preserve">* przyjmowanie niektórych leków lub stosowanie preparatów na skórę, które mogą uczulać lub sprawiać, że skóra jest bardziej wrażliwa na depilację </w:t>
+      </w:r>
+      <w:proofErr w:type="gramStart"/>
+      <w:r>
+        <w:t>( konsultacja</w:t>
+      </w:r>
+      <w:proofErr w:type="gramEnd"/>
+      <w:r>
+        <w:t xml:space="preserve"> z dermatologiem)</w:t>
       </w:r>
     </w:p>
     <w:p>
@@ -258,7 +282,19 @@
     <w:p/>
     <w:p>
       <w:r>
-        <w:t>Wskazówki przed zabiegiem:</w:t>
+        <w:t>Wskazówki</w:t>
+      </w:r>
+      <w:r>
+        <w:t xml:space="preserve"> do</w:t>
+      </w:r>
+      <w:r>
+        <w:t xml:space="preserve"> zabieg</w:t>
+      </w:r>
+      <w:r>
+        <w:t>u</w:t>
+      </w:r>
+      <w:r>
+        <w:t>:</w:t>
       </w:r>
     </w:p>
     <w:p>
@@ -286,10 +322,16 @@
       <w:r>
         <w:t>* unikać sauny, basenu i intensywnego wysiłku przez 24 h</w:t>
       </w:r>
+      <w:r>
+        <w:t xml:space="preserve"> po zabiegu</w:t>
+      </w:r>
     </w:p>
     <w:p>
       <w:r>
         <w:t>* nie opalać skóry przez kilka dni</w:t>
+      </w:r>
+      <w:r>
+        <w:t xml:space="preserve"> po zabiegu</w:t>
       </w:r>
     </w:p>
     <w:p>

</xml_diff>